<commit_message>
feat(acpos): upgrade EDIT grouped precision timeline design contracts
</commit_message>
<xml_diff>
--- a/ACPOS_SYSTEM_LOGIC_GLOBAL_INTEGRATION_Mother_Basic_Design_OPTIMIZED.docx
+++ b/ACPOS_SYSTEM_LOGIC_GLOBAL_INTEGRATION_Mother_Basic_Design_OPTIMIZED.docx
@@ -17689,6 +17689,290 @@
     <w:p>
       <w:r>
         <w:t>[ACPOS-GLOBAL-INTEGRATION-HISTORY-SEPARATION-V1] Batch/workflow/Machine JSON/resume-point ledgers are historical execution evidence and are not Current planning/basic-design Authority. They remain recoverable from source-control/workflow artifact history and MUST NOT be embedded as mutable Current design truth. This Word retains only current integration design contracts, owner/reference semantics, and audit/acceptance planning.</w:t>
+      </w:r>
+    </w:p>
+    <w:p>
+      <w:r>
+        <w:br w:type="page"/>
+      </w:r>
+    </w:p>
+    <w:p>
+      <w:pPr>
+        <w:pStyle w:val="Heading1"/>
+      </w:pPr>
+      <w:r>
+        <w:t>Shared Canonical Time Integration Contract｜共享正式時間整合契約</w:t>
+      </w:r>
+    </w:p>
+    <w:p>
+      <w:r>
+        <w:t>[ACPOS-GLOBAL-CANONICAL-TIME-INTEGRATION-V1] Cross-system rule for media/time-bearing design contracts. EDIT-01 is the first explicit consumer; other pages may reference this contract but MUST NOT create competing time truth.</w:t>
+      </w:r>
+    </w:p>
+    <w:tbl>
+      <w:tblPr>
+        <w:tblStyle w:val="TableGrid"/>
+        <w:tblW w:type="auto" w:w="0"/>
+        <w:tblLook w:firstColumn="1" w:firstRow="1" w:lastColumn="0" w:lastRow="0" w:noHBand="0" w:noVBand="1" w:val="04A0"/>
+      </w:tblPr>
+      <w:tblGrid>
+        <w:gridCol w:w="8014"/>
+        <w:gridCol w:w="8014"/>
+      </w:tblGrid>
+      <w:tr>
+        <w:tc>
+          <w:tcPr>
+            <w:tcW w:type="dxa" w:w="8014"/>
+          </w:tcPr>
+          <w:p>
+            <w:r>
+              <w:t>Integration Rule</w:t>
+            </w:r>
+          </w:p>
+        </w:tc>
+        <w:tc>
+          <w:tcPr>
+            <w:tcW w:type="dxa" w:w="8014"/>
+          </w:tcPr>
+          <w:p>
+            <w:r>
+              <w:t>Normative Requirement</w:t>
+            </w:r>
+          </w:p>
+        </w:tc>
+      </w:tr>
+      <w:tr>
+        <w:tc>
+          <w:tcPr>
+            <w:tcW w:type="dxa" w:w="8014"/>
+          </w:tcPr>
+          <w:p>
+            <w:r>
+              <w:t>Single time truth</w:t>
+            </w:r>
+          </w:p>
+        </w:tc>
+        <w:tc>
+          <w:tcPr>
+            <w:tcW w:type="dxa" w:w="8014"/>
+          </w:tcPr>
+          <w:p>
+            <w:r>
+              <w:t>Time-bearing systems exchange exact CanonicalTimePoint rational values + explicit timebase identity; float seconds alone are forbidden as cross-system authority.</w:t>
+            </w:r>
+          </w:p>
+        </w:tc>
+      </w:tr>
+      <w:tr>
+        <w:tc>
+          <w:tcPr>
+            <w:tcW w:type="dxa" w:w="8014"/>
+          </w:tcPr>
+          <w:p>
+            <w:r>
+              <w:t>Display-unit independence</w:t>
+            </w:r>
+          </w:p>
+        </w:tc>
+        <w:tc>
+          <w:tcPr>
+            <w:tcW w:type="dxa" w:w="8014"/>
+          </w:tcPr>
+          <w:p>
+            <w:r>
+              <w:t>Frame, millisecond, subframe and sample are UI/operation projections over the same canonical value; switching projection cannot mutate time.</w:t>
+            </w:r>
+          </w:p>
+        </w:tc>
+      </w:tr>
+      <w:tr>
+        <w:tc>
+          <w:tcPr>
+            <w:tcW w:type="dxa" w:w="8014"/>
+          </w:tcPr>
+          <w:p>
+            <w:r>
+              <w:t>Source identity</w:t>
+            </w:r>
+          </w:p>
+        </w:tc>
+        <w:tc>
+          <w:tcPr>
+            <w:tcW w:type="dxa" w:w="8014"/>
+          </w:tcPr>
+          <w:p>
+            <w:r>
+              <w:t>Frame rate/sample rate/source version are part of the binding needed to interpret a precise position.</w:t>
+            </w:r>
+          </w:p>
+        </w:tc>
+      </w:tr>
+      <w:tr>
+        <w:tc>
+          <w:tcPr>
+            <w:tcW w:type="dxa" w:w="8014"/>
+          </w:tcPr>
+          <w:p>
+            <w:r>
+              <w:t>Cross-stage handoff</w:t>
+            </w:r>
+          </w:p>
+        </w:tc>
+        <w:tc>
+          <w:tcPr>
+            <w:tcW w:type="dxa" w:w="8014"/>
+          </w:tcPr>
+          <w:p>
+            <w:r>
+              <w:t>ASSET/VIDEO/EDIT/VOICE/QA handoffs that carry timing MUST preserve canonical rational values or a lossless equivalent plus timebase metadata.</w:t>
+            </w:r>
+          </w:p>
+        </w:tc>
+      </w:tr>
+      <w:tr>
+        <w:tc>
+          <w:tcPr>
+            <w:tcW w:type="dxa" w:w="8014"/>
+          </w:tcPr>
+          <w:p>
+            <w:r>
+              <w:t>Video boundary</w:t>
+            </w:r>
+          </w:p>
+        </w:tc>
+        <w:tc>
+          <w:tcPr>
+            <w:tcW w:type="dxa" w:w="8014"/>
+          </w:tcPr>
+          <w:p>
+            <w:r>
+              <w:t>Video edits/visual render boundaries remain frame-addressable; audio/dialogue may refine below a frame without creating a video subframe cut.</w:t>
+            </w:r>
+          </w:p>
+        </w:tc>
+      </w:tr>
+      <w:tr>
+        <w:tc>
+          <w:tcPr>
+            <w:tcW w:type="dxa" w:w="8014"/>
+          </w:tcPr>
+          <w:p>
+            <w:r>
+              <w:t>Audio precision</w:t>
+            </w:r>
+          </w:p>
+        </w:tc>
+        <w:tc>
+          <w:tcPr>
+            <w:tcW w:type="dxa" w:w="8014"/>
+          </w:tcPr>
+          <w:p>
+            <w:r>
+              <w:t>Sample-level operations require exact sample-rate authority; millisecond operation is legal as a rational projection and may require deterministic quantization only at a sample-bound commit.</w:t>
+            </w:r>
+          </w:p>
+        </w:tc>
+      </w:tr>
+      <w:tr>
+        <w:tc>
+          <w:tcPr>
+            <w:tcW w:type="dxa" w:w="8014"/>
+          </w:tcPr>
+          <w:p>
+            <w:r>
+              <w:t>Subtitle precision</w:t>
+            </w:r>
+          </w:p>
+        </w:tc>
+        <w:tc>
+          <w:tcPr>
+            <w:tcW w:type="dxa" w:w="8014"/>
+          </w:tcPr>
+          <w:p>
+            <w:r>
+              <w:t>Subtitle cue timing may be millisecond-addressable; export-specific quantization is a target-format concern and must not overwrite canonical edit truth.</w:t>
+            </w:r>
+          </w:p>
+        </w:tc>
+      </w:tr>
+      <w:tr>
+        <w:tc>
+          <w:tcPr>
+            <w:tcW w:type="dxa" w:w="8014"/>
+          </w:tcPr>
+          <w:p>
+            <w:r>
+              <w:t>LipSync/Dialogue</w:t>
+            </w:r>
+          </w:p>
+        </w:tc>
+        <w:tc>
+          <w:tcPr>
+            <w:tcW w:type="dxa" w:w="8014"/>
+          </w:tcPr>
+          <w:p>
+            <w:r>
+              <w:t>Derived sync/binding status references canonical time + source/version fingerprint; derived status cannot become independent timing authority.</w:t>
+            </w:r>
+          </w:p>
+        </w:tc>
+      </w:tr>
+      <w:tr>
+        <w:tc>
+          <w:tcPr>
+            <w:tcW w:type="dxa" w:w="8014"/>
+          </w:tcPr>
+          <w:p>
+            <w:r>
+              <w:t>Failure propagation</w:t>
+            </w:r>
+          </w:p>
+        </w:tc>
+        <w:tc>
+          <w:tcPr>
+            <w:tcW w:type="dxa" w:w="8014"/>
+          </w:tcPr>
+          <w:p>
+            <w:r>
+              <w:t>Unknown/mismatched timebase or source version is an explicit blocker propagated to the consuming stage; no guessed defaults.</w:t>
+            </w:r>
+          </w:p>
+        </w:tc>
+      </w:tr>
+      <w:tr>
+        <w:tc>
+          <w:tcPr>
+            <w:tcW w:type="dxa" w:w="8014"/>
+          </w:tcPr>
+          <w:p>
+            <w:r>
+              <w:t>Audit evidence</w:t>
+            </w:r>
+          </w:p>
+        </w:tc>
+        <w:tc>
+          <w:tcPr>
+            <w:tcW w:type="dxa" w:w="8014"/>
+          </w:tcPr>
+          <w:p>
+            <w:r>
+              <w:t>Precision edits and quantization, when effectful, must be attributable to exact input version, unit, canonical before/after values and deterministic rule.</w:t>
+            </w:r>
+          </w:p>
+        </w:tc>
+      </w:tr>
+    </w:tbl>
+    <w:p>
+      <w:pPr>
+        <w:pStyle w:val="Heading2"/>
+      </w:pPr>
+      <w:r>
+        <w:t>Cross-System Functional Chain</w:t>
+      </w:r>
+    </w:p>
+    <w:p>
+      <w:r>
+        <w:t>Source/Blueprint Authority → Exact Timebase Resolution → CanonicalTimePoint → Page/Runtime Projection Unit → Authorized Edit/Read → Validation/Quantization if required → Version/Dependency Invalidation → Stage Evaluation → Human Confirm → Render/Lock → QA/Handoff. Any unresolved node fails closed; downstream consumers must not repair by guessing.</w:t>
       </w:r>
     </w:p>
     <w:sectPr>

</xml_diff>

<commit_message>
docs: reconcile current page design-gap ledger
</commit_message>
<xml_diff>
--- a/ACPOS_SYSTEM_LOGIC_GLOBAL_INTEGRATION_Mother_Basic_Design_OPTIMIZED.docx
+++ b/ACPOS_SYSTEM_LOGIC_GLOBAL_INTEGRATION_Mother_Basic_Design_OPTIMIZED.docx
@@ -17973,6 +17973,286 @@
     <w:p>
       <w:r>
         <w:t>Source/Blueprint Authority → Exact Timebase Resolution → CanonicalTimePoint → Page/Runtime Projection Unit → Authorized Edit/Read → Validation/Quantization if required → Version/Dependency Invalidation → Stage Evaluation → Human Confirm → Render/Lock → QA/Handoff. Any unresolved node fails closed; downstream consumers must not repair by guessing.</w:t>
+      </w:r>
+    </w:p>
+    <w:p>
+      <w:pPr>
+        <w:pStyle w:val="Heading1"/>
+      </w:pPr>
+      <w:r>
+        <w:t>Current Page Design-Gap Reconciliation — 2026-09-23</w:t>
+      </w:r>
+    </w:p>
+    <w:p>
+      <w:r>
+        <w:t>[ACPOS-20260923-CURRENT-PAGE-DESIGN-GAP-RECONCILIATION-V1] This section supersedes earlier snapshot counts only for Word Basic Design gap interpretation. Runtime / Production / external evidence blockers remain unchanged and MUST NOT be converted to PASS by this reconciliation.</w:t>
+      </w:r>
+    </w:p>
+    <w:tbl>
+      <w:tblPr>
+        <w:tblW w:type="auto" w:w="0"/>
+        <w:tblLook w:firstColumn="1" w:firstRow="1" w:lastColumn="0" w:lastRow="0" w:noHBand="0" w:noVBand="1" w:val="04A0"/>
+      </w:tblPr>
+      <w:tblGrid>
+        <w:gridCol w:w="2671"/>
+        <w:gridCol w:w="2671"/>
+        <w:gridCol w:w="2671"/>
+        <w:gridCol w:w="2671"/>
+        <w:gridCol w:w="2671"/>
+        <w:gridCol w:w="2671"/>
+      </w:tblGrid>
+      <w:tr>
+        <w:tc>
+          <w:tcPr>
+            <w:tcW w:type="dxa" w:w="2671"/>
+          </w:tcPr>
+          <w:p>
+            <w:r>
+              <w:t>Page UID</w:t>
+            </w:r>
+          </w:p>
+        </w:tc>
+        <w:tc>
+          <w:tcPr>
+            <w:tcW w:type="dxa" w:w="2671"/>
+          </w:tcPr>
+          <w:p>
+            <w:r>
+              <w:t>Earlier snapshot</w:t>
+            </w:r>
+          </w:p>
+        </w:tc>
+        <w:tc>
+          <w:tcPr>
+            <w:tcW w:type="dxa" w:w="2671"/>
+          </w:tcPr>
+          <w:p>
+            <w:r>
+              <w:t>Current reconciliation</w:t>
+            </w:r>
+          </w:p>
+        </w:tc>
+        <w:tc>
+          <w:tcPr>
+            <w:tcW w:type="dxa" w:w="2671"/>
+          </w:tcPr>
+          <w:p>
+            <w:r>
+              <w:t>Word mutation</w:t>
+            </w:r>
+          </w:p>
+        </w:tc>
+        <w:tc>
+          <w:tcPr>
+            <w:tcW w:type="dxa" w:w="2671"/>
+          </w:tcPr>
+          <w:p>
+            <w:r>
+              <w:t>Remaining Word Design Gap</w:t>
+            </w:r>
+          </w:p>
+        </w:tc>
+        <w:tc>
+          <w:tcPr>
+            <w:tcW w:type="dxa" w:w="2671"/>
+          </w:tcPr>
+          <w:p>
+            <w:r>
+              <w:t>Boundary</w:t>
+            </w:r>
+          </w:p>
+        </w:tc>
+      </w:tr>
+      <w:tr>
+        <w:tc>
+          <w:tcPr>
+            <w:tcW w:type="dxa" w:w="2671"/>
+          </w:tcPr>
+          <w:p>
+            <w:r>
+              <w:t>CORE-01</w:t>
+            </w:r>
+          </w:p>
+        </w:tc>
+        <w:tc>
+          <w:tcPr>
+            <w:tcW w:type="dxa" w:w="2671"/>
+          </w:tcPr>
+          <w:p>
+            <w:r>
+              <w:t>T19 snapshot recorded missing_operation=24.</w:t>
+            </w:r>
+          </w:p>
+        </w:tc>
+        <w:tc>
+          <w:tcPr>
+            <w:tcW w:type="dxa" w:w="2671"/>
+          </w:tcPr>
+          <w:p>
+            <w:r>
+              <w:t>22 rows are UI_LOCAL_EXACT and require no server Operation; 2 READ_EXACT rows now reuse existing exact read authorities: getCanonicalScript and compareCoreCandidates.</w:t>
+            </w:r>
+          </w:p>
+        </w:tc>
+        <w:tc>
+          <w:tcPr>
+            <w:tcW w:type="dxa" w:w="2671"/>
+          </w:tcPr>
+          <w:p>
+            <w:r>
+              <w:t>2 exact read bindings added to CORE-01.</w:t>
+            </w:r>
+          </w:p>
+        </w:tc>
+        <w:tc>
+          <w:tcPr>
+            <w:tcW w:type="dxa" w:w="2671"/>
+          </w:tcPr>
+          <w:p>
+            <w:r>
+              <w:t>0 for this Operation denominator.</w:t>
+            </w:r>
+          </w:p>
+        </w:tc>
+        <w:tc>
+          <w:tcPr>
+            <w:tcW w:type="dxa" w:w="2671"/>
+          </w:tcPr>
+          <w:p>
+            <w:r>
+              <w:t>Runtime/Production evidence remains independently governed.</w:t>
+            </w:r>
+          </w:p>
+        </w:tc>
+      </w:tr>
+      <w:tr>
+        <w:tc>
+          <w:tcPr>
+            <w:tcW w:type="dxa" w:w="2671"/>
+          </w:tcPr>
+          <w:p>
+            <w:r>
+              <w:t>ASSET-01</w:t>
+            </w:r>
+          </w:p>
+        </w:tc>
+        <w:tc>
+          <w:tcPr>
+            <w:tcW w:type="dxa" w:w="2671"/>
+          </w:tcPr>
+          <w:p>
+            <w:r>
+              <w:t>Earlier snapshot counts predate later closure tables.</w:t>
+            </w:r>
+          </w:p>
+        </w:tc>
+        <w:tc>
+          <w:tcPr>
+            <w:tcW w:type="dxa" w:w="2671"/>
+          </w:tcPr>
+          <w:p>
+            <w:r>
+              <w:t>Later Batch 16 / Batch 56 authority tables cover all effectful/read controls; remaining empty server-operation fields are UI_LOCAL_EXACT.</w:t>
+            </w:r>
+          </w:p>
+        </w:tc>
+        <w:tc>
+          <w:tcPr>
+            <w:tcW w:type="dxa" w:w="2671"/>
+          </w:tcPr>
+          <w:p>
+            <w:r>
+              <w:t>None.</w:t>
+            </w:r>
+          </w:p>
+        </w:tc>
+        <w:tc>
+          <w:tcPr>
+            <w:tcW w:type="dxa" w:w="2671"/>
+          </w:tcPr>
+          <w:p>
+            <w:r>
+              <w:t>0 for reviewed Operation/Runtime-owner design denominator.</w:t>
+            </w:r>
+          </w:p>
+        </w:tc>
+        <w:tc>
+          <w:tcPr>
+            <w:tcW w:type="dxa" w:w="2671"/>
+          </w:tcPr>
+          <w:p>
+            <w:r>
+              <w:t>No API/Runtime identity invented.</w:t>
+            </w:r>
+          </w:p>
+        </w:tc>
+      </w:tr>
+      <w:tr>
+        <w:tc>
+          <w:tcPr>
+            <w:tcW w:type="dxa" w:w="2671"/>
+          </w:tcPr>
+          <w:p>
+            <w:r>
+              <w:t>VIDEO-01</w:t>
+            </w:r>
+          </w:p>
+        </w:tc>
+        <w:tc>
+          <w:tcPr>
+            <w:tcW w:type="dxa" w:w="2671"/>
+          </w:tcPr>
+          <w:p>
+            <w:r>
+              <w:t>Earlier snapshot counts predate later closure tables.</w:t>
+            </w:r>
+          </w:p>
+        </w:tc>
+        <w:tc>
+          <w:tcPr>
+            <w:tcW w:type="dxa" w:w="2671"/>
+          </w:tcPr>
+          <w:p>
+            <w:r>
+              <w:t>Current control/authority tables bind all non-UI_LOCAL_EXACT effectful/read controls; remaining empty server-operation fields are UI-local.</w:t>
+            </w:r>
+          </w:p>
+        </w:tc>
+        <w:tc>
+          <w:tcPr>
+            <w:tcW w:type="dxa" w:w="2671"/>
+          </w:tcPr>
+          <w:p>
+            <w:r>
+              <w:t>None.</w:t>
+            </w:r>
+          </w:p>
+        </w:tc>
+        <w:tc>
+          <w:tcPr>
+            <w:tcW w:type="dxa" w:w="2671"/>
+          </w:tcPr>
+          <w:p>
+            <w:r>
+              <w:t>0 for reviewed Operation/Runtime-owner design denominator.</w:t>
+            </w:r>
+          </w:p>
+        </w:tc>
+        <w:tc>
+          <w:tcPr>
+            <w:tcW w:type="dxa" w:w="2671"/>
+          </w:tcPr>
+          <w:p>
+            <w:r>
+              <w:t>No API/Runtime identity invented.</w:t>
+            </w:r>
+          </w:p>
+        </w:tc>
+      </w:tr>
+    </w:tbl>
+    <w:p>
+      <w:r>
+        <w:t>Reconciliation rule: newest explicit page closure authority supersedes an earlier aggregate snapshot for design-gap counting; aggregate ledgers MUST NOT be used to reopen a gap already closed by a later exact page authority. Conversely, NOT_EXECUTED / BLOCKED / REQUIRE_EXACT_BINDING remains unresolved when it refers to implementation or evidence not supplied by Current Authority.</w:t>
       </w:r>
     </w:p>
     <w:sectPr>

</xml_diff>